<commit_message>
Document adapt feature - from client source to template structure
</commit_message>
<xml_diff>
--- a/input/templates/meridian-article.docx
+++ b/input/templates/meridian-article.docx
@@ -23,126 +23,6 @@
           <w:b w:val="on"/>
           <w:color w:val="808080"/>
         </w:rPr>
-        <w:t>[[/jcr:content/root/container/mig_hero/publishDateText]]</w:t>
-      </w:r>
-    </w:p>
-    <w:p>
-      <w:r>
-        <w:t>April 18, 2026</w:t>
-      </w:r>
-    </w:p>
-    <w:p/>
-    <w:p>
-      <w:r>
-        <w:rPr>
-          <w:b w:val="on"/>
-          <w:color w:val="808080"/>
-        </w:rPr>
-        <w:t>[[/jcr:content/root/container/mig_hero/authorName]]</w:t>
-      </w:r>
-    </w:p>
-    <w:p>
-      <w:r>
-        <w:t>Lan Pham</w:t>
-      </w:r>
-    </w:p>
-    <w:p/>
-    <w:p>
-      <w:r>
-        <w:rPr>
-          <w:b w:val="on"/>
-          <w:color w:val="808080"/>
-        </w:rPr>
-        <w:t>[[/jcr:content/root/container/mig_hero/eyebrow]]</w:t>
-      </w:r>
-    </w:p>
-    <w:p>
-      <w:r>
-        <w:t>Rail · Da Nang to Hue, Vietnam</w:t>
-      </w:r>
-    </w:p>
-    <w:p/>
-    <w:p>
-      <w:r>
-        <w:rPr>
-          <w:b w:val="on"/>
-          <w:color w:val="808080"/>
-        </w:rPr>
-        <w:t>[[/jcr:content/root/container/mig_hero/readTime]]</w:t>
-      </w:r>
-    </w:p>
-    <w:p>
-      <w:r>
-        <w:t>9 min read</w:t>
-      </w:r>
-    </w:p>
-    <w:p/>
-    <w:p>
-      <w:r>
-        <w:rPr>
-          <w:b w:val="on"/>
-          <w:color w:val="808080"/>
-        </w:rPr>
-        <w:t>[[/jcr:content/root/container/mig_hero/imageAlt]]</w:t>
-      </w:r>
-    </w:p>
-    <w:p>
-      <w:r>
-        <w:t>Train window view along a tropical coastline</w:t>
-      </w:r>
-    </w:p>
-    <w:p/>
-    <w:p>
-      <w:r>
-        <w:rPr>
-          <w:b w:val="on"/>
-          <w:color w:val="808080"/>
-        </w:rPr>
-        <w:t>[[/jcr:content/root/container/mig_hero/dek]]</w:t>
-      </w:r>
-    </w:p>
-    <w:p>
-      <w:r>
-        <w:t>Sea on one side, jungle on the other, and a dining car that believes deeply in instant noodles.</w:t>
-      </w:r>
-    </w:p>
-    <w:p/>
-    <w:p>
-      <w:r>
-        <w:rPr>
-          <w:b w:val="on"/>
-          <w:color w:val="808080"/>
-        </w:rPr>
-        <w:t>[[/jcr:content/root/container/mig_hero/image]]</w:t>
-      </w:r>
-    </w:p>
-    <w:p>
-      <w:r>
-        <w:t>https://images.unsplash.com/photo-1528127269322-539801943592?w=1600&amp;q=80</w:t>
-      </w:r>
-    </w:p>
-    <w:p/>
-    <w:p>
-      <w:r>
-        <w:rPr>
-          <w:b w:val="on"/>
-          <w:color w:val="808080"/>
-        </w:rPr>
-        <w:t>[[/jcr:content/root/container/mig_hero/title]]</w:t>
-      </w:r>
-    </w:p>
-    <w:p>
-      <w:r>
-        <w:t>Slow Train on Vietnam's Central Coast</w:t>
-      </w:r>
-    </w:p>
-    <w:p/>
-    <w:p>
-      <w:r>
-        <w:rPr>
-          <w:b w:val="on"/>
-          <w:color w:val="808080"/>
-        </w:rPr>
         <w:t>[[/jcr:content/root/container/mig_par/body]]</w:t>
       </w:r>
     </w:p>
@@ -248,6 +128,21 @@
           <w:b w:val="on"/>
           <w:color w:val="808080"/>
         </w:rPr>
+        <w:t>[[/jcr:content/root/container/mig_list/listType]]</w:t>
+      </w:r>
+    </w:p>
+    <w:p>
+      <w:r>
+        <w:t>unordered</w:t>
+      </w:r>
+    </w:p>
+    <w:p/>
+    <w:p>
+      <w:r>
+        <w:rPr>
+          <w:b w:val="on"/>
+          <w:color w:val="808080"/>
+        </w:rPr>
         <w:t>[[/jcr:content/root/container/mig_head_3/anchorId]]</w:t>
       </w:r>
     </w:p>
@@ -278,6 +173,21 @@
           <w:b w:val="on"/>
           <w:color w:val="808080"/>
         </w:rPr>
+        <w:t>[[/jcr:content/root/container/mig_list_2/listType]]</w:t>
+      </w:r>
+    </w:p>
+    <w:p>
+      <w:r>
+        <w:t>ordered</w:t>
+      </w:r>
+    </w:p>
+    <w:p/>
+    <w:p>
+      <w:r>
+        <w:rPr>
+          <w:b w:val="on"/>
+          <w:color w:val="808080"/>
+        </w:rPr>
         <w:t>[[/jcr:content/root/container/mig_par_3/body]]</w:t>
       </w:r>
     </w:p>
@@ -323,6 +233,21 @@
           <w:b w:val="on"/>
           <w:color w:val="808080"/>
         </w:rPr>
+        <w:t>[[/jcr:content/root/container/mig_callout/textIsRich]]</w:t>
+      </w:r>
+    </w:p>
+    <w:p>
+      <w:r>
+        <w:t>true</w:t>
+      </w:r>
+    </w:p>
+    <w:p/>
+    <w:p>
+      <w:r>
+        <w:rPr>
+          <w:b w:val="on"/>
+          <w:color w:val="808080"/>
+        </w:rPr>
         <w:t>[[/jcr:content/root/container/mig_callout/initial]]</w:t>
       </w:r>
     </w:p>
@@ -374,66 +299,6 @@
     <w:p>
       <w:r>
         <w:t>Hue's station smells of rain on concrete. I stepped onto the platform with creased tickets and the sense that the coast had been narrated to me in the kindest slow voice.</w:t>
-      </w:r>
-    </w:p>
-    <w:p/>
-    <w:p>
-      <w:r>
-        <w:rPr>
-          <w:b w:val="on"/>
-          <w:color w:val="808080"/>
-        </w:rPr>
-        <w:t>[[/jcr:content/root/container/mig_author/dropInitial]]</w:t>
-      </w:r>
-    </w:p>
-    <w:p>
-      <w:r>
-        <w:t>L</w:t>
-      </w:r>
-    </w:p>
-    <w:p/>
-    <w:p>
-      <w:r>
-        <w:rPr>
-          <w:b w:val="on"/>
-          <w:color w:val="808080"/>
-        </w:rPr>
-        <w:t>[[/jcr:content/root/container/mig_author/authorName]]</w:t>
-      </w:r>
-    </w:p>
-    <w:p>
-      <w:r>
-        <w:t>Lan Pham</w:t>
-      </w:r>
-    </w:p>
-    <w:p/>
-    <w:p>
-      <w:r>
-        <w:rPr>
-          <w:b w:val="on"/>
-          <w:color w:val="808080"/>
-        </w:rPr>
-        <w:t>[[/jcr:content/root/container/mig_author/label]]</w:t>
-      </w:r>
-    </w:p>
-    <w:p>
-      <w:r>
-        <w:t>Written by</w:t>
-      </w:r>
-    </w:p>
-    <w:p/>
-    <w:p>
-      <w:r>
-        <w:rPr>
-          <w:b w:val="on"/>
-          <w:color w:val="808080"/>
-        </w:rPr>
-        <w:t>[[/jcr:content/root/container/mig_author/initials]]</w:t>
-      </w:r>
-    </w:p>
-    <w:p>
-      <w:r>
-        <w:t>LP</w:t>
       </w:r>
     </w:p>
     <w:p/>

</xml_diff>